<commit_message>
Update system design document with audited six-view ERD
</commit_message>
<xml_diff>
--- a/deliverables/EventGate Backend System Design.docx
+++ b/deliverables/EventGate Backend System Design.docx
@@ -2208,7 +2208,7 @@
     </w:p>
     <w:p>
       <w:r>
-        <w:t>PostgreSQL stores 23 entities. The ERD is divided into four named Draw.io views for readability. Tables repeated between views are references to the same physical table. The views show important fields; the dictionary and relationship ledger below record keys and cross view dependencies.</w:t>
+        <w:t>PostgreSQL stores 23 entities. The ERD is divided into six named Draw.io views for readability. Tables repeated between views are references to the same physical table. The views show important fields; the dictionary and relationship ledger below record keys and cross view dependencies.</w:t>
       </w:r>
     </w:p>
     <w:p>
@@ -2229,7 +2229,7 @@
         <w:t xml:space="preserve">Notation </w:t>
       </w:r>
       <w:r>
-        <w:t>PK means primary key, FK means enforced foreign key, UQ means unique, and ? means nullable. Most identifiers are UUIDs. MaintenanceState.id is a text key. A parent with 1 to 0..N children is a one to many association. A unique child FK limits it to zero or one child per parent. Nullable FKs mean a child may have no parent for that association.</w:t>
+        <w:t>PK means primary key, FK means enforced foreign key, UQ means unique, and ? means nullable. Most identifiers are UUIDs. MaintenanceState.id is a text key. A parent with 1 to 0..N children is a one to many association. A unique child FK limits it to zero or one child per parent. Nullable FKs mean a child may have no parent for that association. Each connector is labelled with its relationship role and a : b, meaning a parents per child and b children per parent. For example 1 : 0..N is mandatory one parent per child with zero or many children per parent; 0..1 : 0..N permits a child without that parent. The canonical payment fulfillment link is optional on both sides, 0..1 : 0..1. The PaymentAttempt alias shows a self reference to the same physical table, not another entity.</w:t>
       </w:r>
     </w:p>
     <w:p>
@@ -2313,7 +2313,7 @@
       <w:r>
         <w:drawing>
           <wp:inline xmlns:a="http://schemas.openxmlformats.org/drawingml/2006/main" xmlns:pic="http://schemas.openxmlformats.org/drawingml/2006/picture">
-            <wp:extent cx="9601200" cy="5280660"/>
+            <wp:extent cx="9601200" cy="5082235"/>
             <wp:docPr id="3" name="Picture 3"/>
             <wp:cNvGraphicFramePr>
               <a:graphicFrameLocks noChangeAspect="1"/>
@@ -2334,7 +2334,7 @@
                   <pic:spPr>
                     <a:xfrm>
                       <a:off x="0" y="0"/>
-                      <a:ext cx="9601200" cy="5280660"/>
+                      <a:ext cx="9601200" cy="5082235"/>
                     </a:xfrm>
                     <a:prstGeom prst="rect"/>
                   </pic:spPr>
@@ -2370,7 +2370,7 @@
       <w:r>
         <w:drawing>
           <wp:inline xmlns:a="http://schemas.openxmlformats.org/drawingml/2006/main" xmlns:pic="http://schemas.openxmlformats.org/drawingml/2006/picture">
-            <wp:extent cx="9601200" cy="5280660"/>
+            <wp:extent cx="9601200" cy="4928616"/>
             <wp:docPr id="4" name="Picture 4"/>
             <wp:cNvGraphicFramePr>
               <a:graphicFrameLocks noChangeAspect="1"/>
@@ -2391,7 +2391,7 @@
                   <pic:spPr>
                     <a:xfrm>
                       <a:off x="0" y="0"/>
-                      <a:ext cx="9601200" cy="5280660"/>
+                      <a:ext cx="9601200" cy="4928616"/>
                     </a:xfrm>
                     <a:prstGeom prst="rect"/>
                   </pic:spPr>
@@ -2407,7 +2407,7 @@
         <w:pStyle w:val="Caption"/>
       </w:pPr>
       <w:r>
-        <w:t>Figure 4 Payments admission and canonical purchase fulfillment. Refer to the foreign key ledger for associations that span views.</w:t>
+        <w:t>Figure 4 Payments capture replay canonical fulfillment and refund settlement. Refer to the foreign key ledger for associations that span views.</w:t>
       </w:r>
     </w:p>
     <w:p>
@@ -2427,7 +2427,7 @@
       <w:r>
         <w:drawing>
           <wp:inline xmlns:a="http://schemas.openxmlformats.org/drawingml/2006/main" xmlns:pic="http://schemas.openxmlformats.org/drawingml/2006/picture">
-            <wp:extent cx="8136412" cy="5806440"/>
+            <wp:extent cx="8390809" cy="5806440"/>
             <wp:docPr id="5" name="Picture 5"/>
             <wp:cNvGraphicFramePr>
               <a:graphicFrameLocks noChangeAspect="1"/>
@@ -2448,7 +2448,7 @@
                   <pic:spPr>
                     <a:xfrm>
                       <a:off x="0" y="0"/>
-                      <a:ext cx="8136412" cy="5806440"/>
+                      <a:ext cx="8390809" cy="5806440"/>
                     </a:xfrm>
                     <a:prstGeom prst="rect"/>
                   </pic:spPr>
@@ -2484,7 +2484,7 @@
       <w:r>
         <w:drawing>
           <wp:inline xmlns:a="http://schemas.openxmlformats.org/drawingml/2006/main" xmlns:pic="http://schemas.openxmlformats.org/drawingml/2006/picture">
-            <wp:extent cx="7558679" cy="5806440"/>
+            <wp:extent cx="7846540" cy="5806440"/>
             <wp:docPr id="6" name="Picture 6"/>
             <wp:cNvGraphicFramePr>
               <a:graphicFrameLocks noChangeAspect="1"/>
@@ -2505,7 +2505,7 @@
                   <pic:spPr>
                     <a:xfrm>
                       <a:off x="0" y="0"/>
-                      <a:ext cx="7558679" cy="5806440"/>
+                      <a:ext cx="7846540" cy="5806440"/>
                     </a:xfrm>
                     <a:prstGeom prst="rect"/>
                   </pic:spPr>
@@ -2522,6 +2522,120 @@
       </w:pPr>
       <w:r>
         <w:t>Figure 6 Notifications jobs and audit operations. Refer to the foreign key ledger for associations that span views.</w:t>
+      </w:r>
+    </w:p>
+    <w:p>
+      <w:pPr>
+        <w:sectPr>
+          <w:pgSz w:w="16834" w:h="11909" w:orient="landscape"/>
+          <w:pgMar w:top="648" w:right="792" w:bottom="648" w:left="792" w:header="720" w:footer="720" w:gutter="0"/>
+          <w:cols w:space="720"/>
+          <w:docGrid w:linePitch="360"/>
+        </w:sectPr>
+      </w:pPr>
+    </w:p>
+    <w:p>
+      <w:pPr>
+        <w:spacing w:after="40"/>
+      </w:pPr>
+      <w:r>
+        <w:drawing>
+          <wp:inline xmlns:a="http://schemas.openxmlformats.org/drawingml/2006/main" xmlns:pic="http://schemas.openxmlformats.org/drawingml/2006/picture">
+            <wp:extent cx="9601200" cy="4928616"/>
+            <wp:docPr id="7" name="Picture 7"/>
+            <wp:cNvGraphicFramePr>
+              <a:graphicFrameLocks noChangeAspect="1"/>
+            </wp:cNvGraphicFramePr>
+            <a:graphic>
+              <a:graphicData uri="http://schemas.openxmlformats.org/drawingml/2006/picture">
+                <pic:pic>
+                  <pic:nvPicPr>
+                    <pic:cNvPr id="0" name="eventgate-erd-5.png"/>
+                    <pic:cNvPicPr/>
+                  </pic:nvPicPr>
+                  <pic:blipFill>
+                    <a:blip r:embed="rId20"/>
+                    <a:stretch>
+                      <a:fillRect/>
+                    </a:stretch>
+                  </pic:blipFill>
+                  <pic:spPr>
+                    <a:xfrm>
+                      <a:off x="0" y="0"/>
+                      <a:ext cx="9601200" cy="4928616"/>
+                    </a:xfrm>
+                    <a:prstGeom prst="rect"/>
+                  </pic:spPr>
+                </pic:pic>
+              </a:graphicData>
+            </a:graphic>
+          </wp:inline>
+        </w:drawing>
+      </w:r>
+    </w:p>
+    <w:p>
+      <w:pPr>
+        <w:pStyle w:val="Caption"/>
+      </w:pPr>
+      <w:r>
+        <w:t>Figure 7 Optional delivery links for password recovery and email verification. Refer to the foreign key ledger for associations that span views.</w:t>
+      </w:r>
+    </w:p>
+    <w:p>
+      <w:pPr>
+        <w:sectPr>
+          <w:pgSz w:w="16834" w:h="11909" w:orient="landscape"/>
+          <w:pgMar w:top="648" w:right="792" w:bottom="648" w:left="792" w:header="720" w:footer="720" w:gutter="0"/>
+          <w:cols w:space="720"/>
+          <w:docGrid w:linePitch="360"/>
+        </w:sectPr>
+      </w:pPr>
+    </w:p>
+    <w:p>
+      <w:pPr>
+        <w:spacing w:after="40"/>
+      </w:pPr>
+      <w:r>
+        <w:drawing>
+          <wp:inline xmlns:a="http://schemas.openxmlformats.org/drawingml/2006/main" xmlns:pic="http://schemas.openxmlformats.org/drawingml/2006/picture">
+            <wp:extent cx="9601200" cy="5082235"/>
+            <wp:docPr id="8" name="Picture 8"/>
+            <wp:cNvGraphicFramePr>
+              <a:graphicFrameLocks noChangeAspect="1"/>
+            </wp:cNvGraphicFramePr>
+            <a:graphic>
+              <a:graphicData uri="http://schemas.openxmlformats.org/drawingml/2006/picture">
+                <pic:pic>
+                  <pic:nvPicPr>
+                    <pic:cNvPr id="0" name="eventgate-erd-6.png"/>
+                    <pic:cNvPicPr/>
+                  </pic:nvPicPr>
+                  <pic:blipFill>
+                    <a:blip r:embed="rId21"/>
+                    <a:stretch>
+                      <a:fillRect/>
+                    </a:stretch>
+                  </pic:blipFill>
+                  <pic:spPr>
+                    <a:xfrm>
+                      <a:off x="0" y="0"/>
+                      <a:ext cx="9601200" cy="5082235"/>
+                    </a:xfrm>
+                    <a:prstGeom prst="rect"/>
+                  </pic:spPr>
+                </pic:pic>
+              </a:graphicData>
+            </a:graphic>
+          </wp:inline>
+        </w:drawing>
+      </w:r>
+    </w:p>
+    <w:p>
+      <w:pPr>
+        <w:pStyle w:val="Caption"/>
+      </w:pPr>
+      <w:r>
+        <w:t>Figure 8 Ticket ownership event inventory and optional admission staff. Refer to the foreign key ledger for associations that span views.</w:t>
       </w:r>
     </w:p>
     <w:p>
@@ -27015,7 +27129,7 @@
       </w:r>
     </w:p>
     <w:p>
-      <w:hyperlink r:id="rId20">
+      <w:hyperlink r:id="rId22">
         <w:r>
           <w:rPr>
             <w:color w:val="174D73"/>
@@ -27025,7 +27139,7 @@
       </w:hyperlink>
     </w:p>
     <w:p>
-      <w:hyperlink r:id="rId21">
+      <w:hyperlink r:id="rId23">
         <w:r>
           <w:rPr>
             <w:color w:val="174D73"/>
@@ -27035,7 +27149,7 @@
       </w:hyperlink>
     </w:p>
     <w:p>
-      <w:hyperlink r:id="rId22">
+      <w:hyperlink r:id="rId24">
         <w:r>
           <w:rPr>
             <w:color w:val="174D73"/>

</xml_diff>